<commit_message>
feat(pitch): restructure deck for the live 5-minute pitch
The organisers asked for problem, solution, brief demo, impact — and the
deck was built for the video, so it ended on the demo handoff. Rebuilt to
9 slides in their order, with the demo sitting in the MIDDLE (slide 5)
and impact slides after it: three engines, why it scales, who pays, close.

New slide 3 carries the newcomer framing that matters in this room (a
notary public here is not a notario back home). Slide 4 names The Notario
as built for this hackathon. Fixed the stale 27 -> 34 unit tests, and the
closing slide is now an actual close rather than 'up next: live demo'.

Script rebuilt to match: 11 explicit slide cues, the Ctrl+Tab switch at
slide 5 and back at slide 6, and a two-tabs-one-window setup so Pranav
never re-shares mid-pitch.
</commit_message>
<xml_diff>
--- a/pitch/FoolProof-DemoDay-SCRIPT.docx
+++ b/pitch/FoolProof-DemoDay-SCRIPT.docx
@@ -948,7 +948,137 @@
           <w:sz w:val="21"/>
           <w:szCs w:val="21"/>
         </w:rPr>
-        <w:t xml:space="preserve">Start the screen already on the Welcome page, scrolled to the top.</w:t>
+        <w:t xml:space="preserve">Open TWO TABS IN THE SAME BROWSER WINDOW: tab 1 = </w:t>
+      </w:r>
+      <w:r>
+        <w:rPr>
+          <w:rFonts w:ascii="Consolas" w:cs="Consolas" w:eastAsia="Consolas" w:hAnsi="Consolas"/>
+          <w:b/>
+          <w:bCs/>
+          <w:color w:val="1C1917"/>
+          <w:sz w:val="21"/>
+          <w:szCs w:val="21"/>
+        </w:rPr>
+        <w:t xml:space="preserve">pitch/deck.html</w:t>
+      </w:r>
+      <w:r>
+        <w:rPr>
+          <w:rFonts w:ascii="Calibri" w:cs="Calibri" w:eastAsia="Calibri" w:hAnsi="Calibri"/>
+          <w:sz w:val="21"/>
+          <w:szCs w:val="21"/>
+        </w:rPr>
+        <w:t xml:space="preserve"> (press F11 for fullscreen), tab 2 = </w:t>
+      </w:r>
+      <w:r>
+        <w:rPr>
+          <w:rFonts w:ascii="Consolas" w:cs="Consolas" w:eastAsia="Consolas" w:hAnsi="Consolas"/>
+          <w:b/>
+          <w:bCs/>
+          <w:color w:val="1C1917"/>
+          <w:sz w:val="21"/>
+          <w:szCs w:val="21"/>
+        </w:rPr>
+        <w:t xml:space="preserve">localhost:5173</w:t>
+      </w:r>
+      <w:r>
+        <w:rPr>
+          <w:rFonts w:ascii="Calibri" w:cs="Calibri" w:eastAsia="Calibri" w:hAnsi="Calibri"/>
+          <w:sz w:val="21"/>
+          <w:szCs w:val="21"/>
+        </w:rPr>
+        <w:t xml:space="preserve">. Pranav shares that ONE window and switches with Ctrl+Tab — no re-sharing mid-pitch.</w:t>
+      </w:r>
+    </w:p>
+    <w:p>
+      <w:pPr>
+        <w:pStyle w:val="ListParagraph"/>
+        <w:numPr>
+          <w:ilvl w:val="0"/>
+          <w:numId w:val="2"/>
+        </w:numPr>
+        <w:spacing w:after="60"/>
+      </w:pPr>
+      <w:r>
+        <w:rPr>
+          <w:rFonts w:ascii="Calibri" w:cs="Calibri" w:eastAsia="Calibri" w:hAnsi="Calibri"/>
+          <w:sz w:val="21"/>
+          <w:szCs w:val="21"/>
+        </w:rPr>
+        <w:t xml:space="preserve">In the deck, press </w:t>
+      </w:r>
+      <w:r>
+        <w:rPr>
+          <w:rFonts w:ascii="Consolas" w:cs="Consolas" w:eastAsia="Consolas" w:hAnsi="Consolas"/>
+          <w:b/>
+          <w:bCs/>
+          <w:color w:val="1C1917"/>
+          <w:sz w:val="21"/>
+          <w:szCs w:val="21"/>
+        </w:rPr>
+        <w:t xml:space="preserve">H</w:t>
+      </w:r>
+      <w:r>
+        <w:rPr>
+          <w:rFonts w:ascii="Calibri" w:cs="Calibri" w:eastAsia="Calibri" w:hAnsi="Calibri"/>
+          <w:sz w:val="21"/>
+          <w:szCs w:val="21"/>
+        </w:rPr>
+        <w:t xml:space="preserve"> to check the slide map, then press </w:t>
+      </w:r>
+      <w:r>
+        <w:rPr>
+          <w:rFonts w:ascii="Consolas" w:cs="Consolas" w:eastAsia="Consolas" w:hAnsi="Consolas"/>
+          <w:b/>
+          <w:bCs/>
+          <w:color w:val="1C1917"/>
+          <w:sz w:val="21"/>
+          <w:szCs w:val="21"/>
+        </w:rPr>
+        <w:t xml:space="preserve">H</w:t>
+      </w:r>
+      <w:r>
+        <w:rPr>
+          <w:rFonts w:ascii="Calibri" w:cs="Calibri" w:eastAsia="Calibri" w:hAnsi="Calibri"/>
+          <w:sz w:val="21"/>
+          <w:szCs w:val="21"/>
+        </w:rPr>
+        <w:t xml:space="preserve"> again to HIDE it. Do not present with it showing.</w:t>
+      </w:r>
+    </w:p>
+    <w:p>
+      <w:pPr>
+        <w:pStyle w:val="ListParagraph"/>
+        <w:numPr>
+          <w:ilvl w:val="0"/>
+          <w:numId w:val="2"/>
+        </w:numPr>
+        <w:spacing w:after="60"/>
+      </w:pPr>
+      <w:r>
+        <w:rPr>
+          <w:rFonts w:ascii="Calibri" w:cs="Calibri" w:eastAsia="Calibri" w:hAnsi="Calibri"/>
+          <w:sz w:val="21"/>
+          <w:szCs w:val="21"/>
+        </w:rPr>
+        <w:t xml:space="preserve">Start on deck SLIDE 1 (the title card) while you are being introduced.</w:t>
+      </w:r>
+    </w:p>
+    <w:p>
+      <w:pPr>
+        <w:pStyle w:val="ListParagraph"/>
+        <w:numPr>
+          <w:ilvl w:val="0"/>
+          <w:numId w:val="2"/>
+        </w:numPr>
+        <w:spacing w:after="60"/>
+      </w:pPr>
+      <w:r>
+        <w:rPr>
+          <w:rFonts w:ascii="Calibri" w:cs="Calibri" w:eastAsia="Calibri" w:hAnsi="Calibri"/>
+          <w:sz w:val="21"/>
+          <w:szCs w:val="21"/>
+        </w:rPr>
+        <w:t xml:space="preserve">Rehearse the Ctrl+Tab switch at slide 5 and the switch back — that is the only risky move in the whole pitch.</w:t>
       </w:r>
     </w:p>
     <w:p>
@@ -1175,7 +1305,45 @@
           <w:sz w:val="21"/>
           <w:szCs w:val="21"/>
         </w:rPr>
-        <w:t xml:space="preserve">Hold on the Welcome page. Do nothing for the first fifteen seconds.</w:t>
+        <w:t xml:space="preserve">Start on </w:t>
+      </w:r>
+      <w:r>
+        <w:rPr>
+          <w:rFonts w:ascii="Consolas" w:cs="Consolas" w:eastAsia="Consolas" w:hAnsi="Consolas"/>
+          <w:b/>
+          <w:bCs/>
+          <w:color w:val="1C1917"/>
+          <w:sz w:val="21"/>
+          <w:szCs w:val="21"/>
+        </w:rPr>
+        <w:t xml:space="preserve">SLIDE 1</w:t>
+      </w:r>
+      <w:r>
+        <w:rPr>
+          <w:rFonts w:ascii="Calibri" w:cs="Calibri" w:eastAsia="Calibri" w:hAnsi="Calibri"/>
+          <w:sz w:val="21"/>
+          <w:szCs w:val="21"/>
+        </w:rPr>
+        <w:t xml:space="preserve"> (title). On Om's first word, press → to </w:t>
+      </w:r>
+      <w:r>
+        <w:rPr>
+          <w:rFonts w:ascii="Consolas" w:cs="Consolas" w:eastAsia="Consolas" w:hAnsi="Consolas"/>
+          <w:b/>
+          <w:bCs/>
+          <w:color w:val="1C1917"/>
+          <w:sz w:val="21"/>
+          <w:szCs w:val="21"/>
+        </w:rPr>
+        <w:t xml:space="preserve">SLIDE 2</w:t>
+      </w:r>
+      <w:r>
+        <w:rPr>
+          <w:rFonts w:ascii="Calibri" w:cs="Calibri" w:eastAsia="Calibri" w:hAnsi="Calibri"/>
+          <w:sz w:val="21"/>
+          <w:szCs w:val="21"/>
+        </w:rPr>
+        <w:t xml:space="preserve"> — the $15.9B card.</w:t>
       </w:r>
     </w:p>
     <w:p>
@@ -1193,7 +1361,26 @@
           <w:sz w:val="21"/>
           <w:szCs w:val="21"/>
         </w:rPr>
-        <w:t xml:space="preserve">Scroll down slowly so the WANTED cards are visible on “whoever does not know the rules yet.”</w:t>
+        <w:t xml:space="preserve">On “But here is what matters in this room”, press → to </w:t>
+      </w:r>
+      <w:r>
+        <w:rPr>
+          <w:rFonts w:ascii="Consolas" w:cs="Consolas" w:eastAsia="Consolas" w:hAnsi="Consolas"/>
+          <w:b/>
+          <w:bCs/>
+          <w:color w:val="1C1917"/>
+          <w:sz w:val="21"/>
+          <w:szCs w:val="21"/>
+        </w:rPr>
+        <w:t xml:space="preserve">SLIDE 3</w:t>
+      </w:r>
+      <w:r>
+        <w:rPr>
+          <w:rFonts w:ascii="Calibri" w:cs="Calibri" w:eastAsia="Calibri" w:hAnsi="Calibri"/>
+          <w:sz w:val="21"/>
+          <w:szCs w:val="21"/>
+        </w:rPr>
+        <w:t xml:space="preserve"> — “Fraud doesn't target the gullible.”</w:t>
       </w:r>
     </w:p>
     <w:p>
@@ -1211,7 +1398,7 @@
           <w:sz w:val="21"/>
           <w:szCs w:val="21"/>
         </w:rPr>
-        <w:t xml:space="preserve">Scroll back to the top.</w:t>
+        <w:t xml:space="preserve">Then hold. Slide 3 carries the rest of Om's lines — do not advance early.</w:t>
       </w:r>
     </w:p>
     <w:p>
@@ -1381,7 +1568,7 @@
           <w:sz w:val="21"/>
           <w:szCs w:val="21"/>
         </w:rPr>
-        <w:t xml:space="preserve">Click </w:t>
+        <w:t xml:space="preserve">Press → to </w:t>
       </w:r>
       <w:r>
         <w:rPr>
@@ -1392,6 +1579,99 @@
           <w:sz w:val="21"/>
           <w:szCs w:val="21"/>
         </w:rPr>
+        <w:t xml:space="preserve">SLIDE 4</w:t>
+      </w:r>
+      <w:r>
+        <w:rPr>
+          <w:rFonts w:ascii="Calibri" w:cs="Calibri" w:eastAsia="Calibri" w:hAnsi="Calibri"/>
+          <w:sz w:val="21"/>
+          <w:szCs w:val="21"/>
+        </w:rPr>
+        <w:t xml:space="preserve"> — “So we built AI that tries to rob you”, with the five adversaries.</w:t>
+      </w:r>
+    </w:p>
+    <w:p>
+      <w:pPr>
+        <w:pStyle w:val="ListParagraph"/>
+        <w:numPr>
+          <w:ilvl w:val="0"/>
+          <w:numId w:val="3"/>
+        </w:numPr>
+        <w:spacing w:after="50"/>
+      </w:pPr>
+      <w:r>
+        <w:rPr>
+          <w:rFonts w:ascii="Calibri" w:cs="Calibri" w:eastAsia="Calibri" w:hAnsi="Calibri"/>
+          <w:sz w:val="21"/>
+          <w:szCs w:val="21"/>
+        </w:rPr>
+        <w:t xml:space="preserve">On “we built a new one”, press → to </w:t>
+      </w:r>
+      <w:r>
+        <w:rPr>
+          <w:rFonts w:ascii="Consolas" w:cs="Consolas" w:eastAsia="Consolas" w:hAnsi="Consolas"/>
+          <w:b/>
+          <w:bCs/>
+          <w:color w:val="1C1917"/>
+          <w:sz w:val="21"/>
+          <w:szCs w:val="21"/>
+        </w:rPr>
+        <w:t xml:space="preserve">SLIDE 5</w:t>
+      </w:r>
+      <w:r>
+        <w:rPr>
+          <w:rFonts w:ascii="Calibri" w:cs="Calibri" w:eastAsia="Calibri" w:hAnsi="Calibri"/>
+          <w:sz w:val="21"/>
+          <w:szCs w:val="21"/>
+        </w:rPr>
+        <w:t xml:space="preserve"> — the LIVE DEMO card.</w:t>
+      </w:r>
+    </w:p>
+    <w:p>
+      <w:pPr>
+        <w:pStyle w:val="ListParagraph"/>
+        <w:numPr>
+          <w:ilvl w:val="0"/>
+          <w:numId w:val="3"/>
+        </w:numPr>
+        <w:spacing w:after="50"/>
+      </w:pPr>
+      <w:r>
+        <w:rPr>
+          <w:rFonts w:ascii="Calibri" w:cs="Calibri" w:eastAsia="Calibri" w:hAnsi="Calibri"/>
+          <w:sz w:val="21"/>
+          <w:szCs w:val="21"/>
+        </w:rPr>
+        <w:t xml:space="preserve">On “Let me show you” — </w:t>
+      </w:r>
+      <w:r>
+        <w:rPr>
+          <w:rFonts w:ascii="Consolas" w:cs="Consolas" w:eastAsia="Consolas" w:hAnsi="Consolas"/>
+          <w:b/>
+          <w:bCs/>
+          <w:color w:val="1C1917"/>
+          <w:sz w:val="21"/>
+          <w:szCs w:val="21"/>
+        </w:rPr>
+        <w:t xml:space="preserve">Ctrl+Tab</w:t>
+      </w:r>
+      <w:r>
+        <w:rPr>
+          <w:rFonts w:ascii="Calibri" w:cs="Calibri" w:eastAsia="Calibri" w:hAnsi="Calibri"/>
+          <w:sz w:val="21"/>
+          <w:szCs w:val="21"/>
+        </w:rPr>
+        <w:t xml:space="preserve"> to the app, then click </w:t>
+      </w:r>
+      <w:r>
+        <w:rPr>
+          <w:rFonts w:ascii="Consolas" w:cs="Consolas" w:eastAsia="Consolas" w:hAnsi="Consolas"/>
+          <w:b/>
+          <w:bCs/>
+          <w:color w:val="1C1917"/>
+          <w:sz w:val="21"/>
+          <w:szCs w:val="21"/>
+        </w:rPr>
         <w:t xml:space="preserve">GAUNTLET</w:t>
       </w:r>
       <w:r>
@@ -1400,7 +1680,7 @@
           <w:sz w:val="21"/>
           <w:szCs w:val="21"/>
         </w:rPr>
-        <w:t xml:space="preserve"> in the top nav on “Let me show you.”</w:t>
+        <w:t xml:space="preserve">.</w:t>
       </w:r>
     </w:p>
     <w:p>
@@ -2535,7 +2815,7 @@
           <w:sz w:val="21"/>
           <w:szCs w:val="21"/>
         </w:rPr>
-        <w:t xml:space="preserve">Stay on the Evidence File while Om says “three things make that number trustworthy” — the screen is proving it.</w:t>
+        <w:t xml:space="preserve">Hold on the Evidence File for Om's first sentence — the screen is proving the words.</w:t>
       </w:r>
     </w:p>
     <w:p>
@@ -2553,7 +2833,7 @@
           <w:sz w:val="21"/>
           <w:szCs w:val="21"/>
         </w:rPr>
-        <w:t xml:space="preserve">On “who pays” — click the </w:t>
+        <w:t xml:space="preserve">On “The scammer is a JSON playbook” — </w:t>
       </w:r>
       <w:r>
         <w:rPr>
@@ -2564,15 +2844,15 @@
           <w:sz w:val="21"/>
           <w:szCs w:val="21"/>
         </w:rPr>
-        <w:t xml:space="preserve">FOOLPROOF</w:t>
-      </w:r>
-      <w:r>
-        <w:rPr>
-          <w:rFonts w:ascii="Calibri" w:cs="Calibri" w:eastAsia="Calibri" w:hAnsi="Calibri"/>
-          <w:sz w:val="21"/>
-          <w:szCs w:val="21"/>
-        </w:rPr>
-        <w:t xml:space="preserve"> logo, then in the footer click </w:t>
+        <w:t xml:space="preserve">Ctrl+Tab</w:t>
+      </w:r>
+      <w:r>
+        <w:rPr>
+          <w:rFonts w:ascii="Calibri" w:cs="Calibri" w:eastAsia="Calibri" w:hAnsi="Calibri"/>
+          <w:sz w:val="21"/>
+          <w:szCs w:val="21"/>
+        </w:rPr>
+        <w:t xml:space="preserve"> back to the deck. You land on </w:t>
       </w:r>
       <w:r>
         <w:rPr>
@@ -2583,15 +2863,34 @@
           <w:sz w:val="21"/>
           <w:szCs w:val="21"/>
         </w:rPr>
-        <w:t xml:space="preserve">FoolProof for institutions →</w:t>
-      </w:r>
-      <w:r>
-        <w:rPr>
-          <w:rFonts w:ascii="Calibri" w:cs="Calibri" w:eastAsia="Calibri" w:hAnsi="Calibri"/>
-          <w:sz w:val="21"/>
-          <w:szCs w:val="21"/>
-        </w:rPr>
-        <w:t xml:space="preserve">.</w:t>
+        <w:t xml:space="preserve">SLIDE 5</w:t>
+      </w:r>
+      <w:r>
+        <w:rPr>
+          <w:rFonts w:ascii="Calibri" w:cs="Calibri" w:eastAsia="Calibri" w:hAnsi="Calibri"/>
+          <w:sz w:val="21"/>
+          <w:szCs w:val="21"/>
+        </w:rPr>
+        <w:t xml:space="preserve">; press → once to </w:t>
+      </w:r>
+      <w:r>
+        <w:rPr>
+          <w:rFonts w:ascii="Consolas" w:cs="Consolas" w:eastAsia="Consolas" w:hAnsi="Consolas"/>
+          <w:b/>
+          <w:bCs/>
+          <w:color w:val="1C1917"/>
+          <w:sz w:val="21"/>
+          <w:szCs w:val="21"/>
+        </w:rPr>
+        <w:t xml:space="preserve">SLIDE 6</w:t>
+      </w:r>
+      <w:r>
+        <w:rPr>
+          <w:rFonts w:ascii="Calibri" w:cs="Calibri" w:eastAsia="Calibri" w:hAnsi="Calibri"/>
+          <w:sz w:val="21"/>
+          <w:szCs w:val="21"/>
+        </w:rPr>
+        <w:t xml:space="preserve"> (three engines).</w:t>
       </w:r>
     </w:p>
     <w:p>
@@ -2609,7 +2908,63 @@
           <w:sz w:val="21"/>
           <w:szCs w:val="21"/>
         </w:rPr>
-        <w:t xml:space="preserve">Scroll the three revenue-stream cards slowly.</w:t>
+        <w:t xml:space="preserve">On “That is why this scales” — press → to </w:t>
+      </w:r>
+      <w:r>
+        <w:rPr>
+          <w:rFonts w:ascii="Consolas" w:cs="Consolas" w:eastAsia="Consolas" w:hAnsi="Consolas"/>
+          <w:b/>
+          <w:bCs/>
+          <w:color w:val="1C1917"/>
+          <w:sz w:val="21"/>
+          <w:szCs w:val="21"/>
+        </w:rPr>
+        <w:t xml:space="preserve">SLIDE 7</w:t>
+      </w:r>
+      <w:r>
+        <w:rPr>
+          <w:rFonts w:ascii="Calibri" w:cs="Calibri" w:eastAsia="Calibri" w:hAnsi="Calibri"/>
+          <w:sz w:val="21"/>
+          <w:szCs w:val="21"/>
+        </w:rPr>
+        <w:t xml:space="preserve"> (content, not code).</w:t>
+      </w:r>
+    </w:p>
+    <w:p>
+      <w:pPr>
+        <w:pStyle w:val="ListParagraph"/>
+        <w:numPr>
+          <w:ilvl w:val="0"/>
+          <w:numId w:val="3"/>
+        </w:numPr>
+        <w:spacing w:after="50"/>
+      </w:pPr>
+      <w:r>
+        <w:rPr>
+          <w:rFonts w:ascii="Calibri" w:cs="Calibri" w:eastAsia="Calibri" w:hAnsi="Calibri"/>
+          <w:sz w:val="21"/>
+          <w:szCs w:val="21"/>
+        </w:rPr>
+        <w:t xml:space="preserve">On “And who pays?” — press → to </w:t>
+      </w:r>
+      <w:r>
+        <w:rPr>
+          <w:rFonts w:ascii="Consolas" w:cs="Consolas" w:eastAsia="Consolas" w:hAnsi="Consolas"/>
+          <w:b/>
+          <w:bCs/>
+          <w:color w:val="1C1917"/>
+          <w:sz w:val="21"/>
+          <w:szCs w:val="21"/>
+        </w:rPr>
+        <w:t xml:space="preserve">SLIDE 8</w:t>
+      </w:r>
+      <w:r>
+        <w:rPr>
+          <w:rFonts w:ascii="Calibri" w:cs="Calibri" w:eastAsia="Calibri" w:hAnsi="Calibri"/>
+          <w:sz w:val="21"/>
+          <w:szCs w:val="21"/>
+        </w:rPr>
+        <w:t xml:space="preserve"> (KnowBe4 / three streams).</w:t>
       </w:r>
     </w:p>
     <w:p>
@@ -2637,7 +2992,7 @@
           <w:sz w:val="19"/>
           <w:szCs w:val="19"/>
         </w:rPr>
-        <w:t xml:space="preserve">That page is shipped inside the product, not a slide. If a judge looks sceptical, Om can say so in four words: “this is in the product.”</w:t>
+        <w:t xml:space="preserve">If a judge asks about the business in Q&amp;A, Pranav can Ctrl+Tab to the app and open /for-institutions — that page is shipped inside the product, not just a slide. Do not spend pitch time on it; slide 8 covers it.</w:t>
       </w:r>
     </w:p>
     <w:p>
@@ -2684,6 +3039,60 @@
     </w:p>
     <w:p>
       <w:pPr>
+        <w:spacing w:after="40" w:before="70"/>
+      </w:pPr>
+      <w:r>
+        <w:rPr>
+          <w:rFonts w:ascii="Calibri" w:cs="Calibri" w:eastAsia="Calibri" w:hAnsi="Calibri"/>
+          <w:b/>
+          <w:bCs/>
+          <w:caps/>
+          <w:color w:val="2E7D4F"/>
+          <w:sz w:val="20"/>
+          <w:szCs w:val="20"/>
+        </w:rPr>
+        <w:t xml:space="preserve">PRANAV DOES</w:t>
+      </w:r>
+    </w:p>
+    <w:p>
+      <w:pPr>
+        <w:pStyle w:val="ListParagraph"/>
+        <w:numPr>
+          <w:ilvl w:val="0"/>
+          <w:numId w:val="3"/>
+        </w:numPr>
+        <w:spacing w:after="50"/>
+      </w:pPr>
+      <w:r>
+        <w:rPr>
+          <w:rFonts w:ascii="Calibri" w:cs="Calibri" w:eastAsia="Calibri" w:hAnsi="Calibri"/>
+          <w:sz w:val="21"/>
+          <w:szCs w:val="21"/>
+        </w:rPr>
+        <w:t xml:space="preserve">Press → to </w:t>
+      </w:r>
+      <w:r>
+        <w:rPr>
+          <w:rFonts w:ascii="Consolas" w:cs="Consolas" w:eastAsia="Consolas" w:hAnsi="Consolas"/>
+          <w:b/>
+          <w:bCs/>
+          <w:color w:val="1C1917"/>
+          <w:sz w:val="21"/>
+          <w:szCs w:val="21"/>
+        </w:rPr>
+        <w:t xml:space="preserve">SLIDE 9</w:t>
+      </w:r>
+      <w:r>
+        <w:rPr>
+          <w:rFonts w:ascii="Calibri" w:cs="Calibri" w:eastAsia="Calibri" w:hAnsi="Calibri"/>
+          <w:sz w:val="21"/>
+          <w:szCs w:val="21"/>
+        </w:rPr>
+        <w:t xml:space="preserve"> — the closing card. Leave it up through Q&amp;A.</w:t>
+      </w:r>
+    </w:p>
+    <w:p>
+      <w:pPr>
         <w:spacing w:after="40" w:before="130"/>
       </w:pPr>
       <w:r>
@@ -3154,6 +3563,24 @@
           <w:szCs w:val="21"/>
         </w:rPr>
         <w:t xml:space="preserve"> and let Om narrate over it. It drives itself.</w:t>
+      </w:r>
+    </w:p>
+    <w:p>
+      <w:pPr>
+        <w:pStyle w:val="ListParagraph"/>
+        <w:numPr>
+          <w:ilvl w:val="0"/>
+          <w:numId w:val="2"/>
+        </w:numPr>
+        <w:spacing w:after="60"/>
+      </w:pPr>
+      <w:r>
+        <w:rPr>
+          <w:rFonts w:ascii="Calibri" w:cs="Calibri" w:eastAsia="Calibri" w:hAnsi="Calibri"/>
+          <w:sz w:val="21"/>
+          <w:szCs w:val="21"/>
+        </w:rPr>
+        <w:t xml:space="preserve">Deck refuses to advance → click once on the slide first (the browser needs focus for arrow keys), then press →.</w:t>
       </w:r>
     </w:p>
     <w:p>

</xml_diff>